<commit_message>
reflection document and requirement elicitation update
</commit_message>
<xml_diff>
--- a/Requirements Elicitation.docx
+++ b/Requirements Elicitation.docx
@@ -1458,19 +1458,19 @@
         <w:tblLook w:val="04A0" w:firstRow="1" w:lastRow="0" w:firstColumn="1" w:lastColumn="0" w:noHBand="0" w:noVBand="1"/>
       </w:tblPr>
       <w:tblGrid>
-        <w:gridCol w:w="552"/>
-        <w:gridCol w:w="1417"/>
-        <w:gridCol w:w="1691"/>
-        <w:gridCol w:w="858"/>
-        <w:gridCol w:w="943"/>
-        <w:gridCol w:w="1478"/>
-        <w:gridCol w:w="876"/>
-        <w:gridCol w:w="1201"/>
+        <w:gridCol w:w="654"/>
+        <w:gridCol w:w="1400"/>
+        <w:gridCol w:w="1669"/>
+        <w:gridCol w:w="849"/>
+        <w:gridCol w:w="932"/>
+        <w:gridCol w:w="1459"/>
+        <w:gridCol w:w="867"/>
+        <w:gridCol w:w="1186"/>
       </w:tblGrid>
       <w:tr>
         <w:tc>
           <w:tcPr>
-            <w:tcW w:w="552" w:type="dxa"/>
+            <w:tcW w:w="654" w:type="dxa"/>
           </w:tcPr>
           <w:p>
             <w:pPr>
@@ -1492,7 +1492,7 @@
         </w:tc>
         <w:tc>
           <w:tcPr>
-            <w:tcW w:w="1417" w:type="dxa"/>
+            <w:tcW w:w="1400" w:type="dxa"/>
           </w:tcPr>
           <w:p>
             <w:pPr>
@@ -1513,7 +1513,7 @@
         </w:tc>
         <w:tc>
           <w:tcPr>
-            <w:tcW w:w="1691" w:type="dxa"/>
+            <w:tcW w:w="1669" w:type="dxa"/>
           </w:tcPr>
           <w:p>
             <w:pPr>
@@ -1534,7 +1534,7 @@
         </w:tc>
         <w:tc>
           <w:tcPr>
-            <w:tcW w:w="858" w:type="dxa"/>
+            <w:tcW w:w="849" w:type="dxa"/>
           </w:tcPr>
           <w:p>
             <w:pPr>
@@ -1555,7 +1555,7 @@
         </w:tc>
         <w:tc>
           <w:tcPr>
-            <w:tcW w:w="943" w:type="dxa"/>
+            <w:tcW w:w="932" w:type="dxa"/>
           </w:tcPr>
           <w:p>
             <w:pPr>
@@ -1576,7 +1576,7 @@
         </w:tc>
         <w:tc>
           <w:tcPr>
-            <w:tcW w:w="1478" w:type="dxa"/>
+            <w:tcW w:w="1459" w:type="dxa"/>
           </w:tcPr>
           <w:p>
             <w:pPr>
@@ -1597,7 +1597,7 @@
         </w:tc>
         <w:tc>
           <w:tcPr>
-            <w:tcW w:w="876" w:type="dxa"/>
+            <w:tcW w:w="867" w:type="dxa"/>
           </w:tcPr>
           <w:p>
             <w:pPr>
@@ -1618,7 +1618,7 @@
         </w:tc>
         <w:tc>
           <w:tcPr>
-            <w:tcW w:w="1201" w:type="dxa"/>
+            <w:tcW w:w="1186" w:type="dxa"/>
           </w:tcPr>
           <w:p>
             <w:pPr>
@@ -1641,7 +1641,7 @@
       <w:tr>
         <w:tc>
           <w:tcPr>
-            <w:tcW w:w="552" w:type="dxa"/>
+            <w:tcW w:w="654" w:type="dxa"/>
           </w:tcPr>
           <w:p>
             <w:r>
@@ -1651,7 +1651,7 @@
         </w:tc>
         <w:tc>
           <w:tcPr>
-            <w:tcW w:w="1417" w:type="dxa"/>
+            <w:tcW w:w="1400" w:type="dxa"/>
           </w:tcPr>
           <w:p>
             <w:r>
@@ -1673,7 +1673,7 @@
         </w:tc>
         <w:tc>
           <w:tcPr>
-            <w:tcW w:w="1691" w:type="dxa"/>
+            <w:tcW w:w="1669" w:type="dxa"/>
           </w:tcPr>
           <w:p>
             <w:r>
@@ -1683,13 +1683,13 @@
         </w:tc>
         <w:tc>
           <w:tcPr>
-            <w:tcW w:w="858" w:type="dxa"/>
+            <w:tcW w:w="849" w:type="dxa"/>
           </w:tcPr>
           <w:p/>
         </w:tc>
         <w:tc>
           <w:tcPr>
-            <w:tcW w:w="943" w:type="dxa"/>
+            <w:tcW w:w="932" w:type="dxa"/>
           </w:tcPr>
           <w:p>
             <w:r>
@@ -1699,7 +1699,7 @@
         </w:tc>
         <w:tc>
           <w:tcPr>
-            <w:tcW w:w="1478" w:type="dxa"/>
+            <w:tcW w:w="1459" w:type="dxa"/>
           </w:tcPr>
           <w:p>
             <w:r>
@@ -1712,7 +1712,7 @@
         </w:tc>
         <w:tc>
           <w:tcPr>
-            <w:tcW w:w="876" w:type="dxa"/>
+            <w:tcW w:w="867" w:type="dxa"/>
           </w:tcPr>
           <w:p>
             <w:r>
@@ -1722,7 +1722,7 @@
         </w:tc>
         <w:tc>
           <w:tcPr>
-            <w:tcW w:w="1201" w:type="dxa"/>
+            <w:tcW w:w="1186" w:type="dxa"/>
           </w:tcPr>
           <w:p/>
         </w:tc>
@@ -1730,45 +1730,52 @@
       <w:tr>
         <w:tc>
           <w:tcPr>
-            <w:tcW w:w="552" w:type="dxa"/>
+            <w:tcW w:w="654" w:type="dxa"/>
+          </w:tcPr>
+          <w:p>
+            <w:r>
+              <w:t>FR</w:t>
+            </w:r>
+            <w:r>
+              <w:t>2</w:t>
+            </w:r>
+          </w:p>
+        </w:tc>
+        <w:tc>
+          <w:tcPr>
+            <w:tcW w:w="1400" w:type="dxa"/>
+          </w:tcPr>
+          <w:p>
+            <w:r>
+              <w:t xml:space="preserve">The test harness </w:t>
+            </w:r>
+            <w:r>
+              <w:t>shall simulate Best Practice integration through Halo Connect</w:t>
+            </w:r>
+            <w:r>
+              <w:t xml:space="preserve"> exposing FHIR compliant interfaces.</w:t>
+            </w:r>
+          </w:p>
+        </w:tc>
+        <w:tc>
+          <w:tcPr>
+            <w:tcW w:w="1669" w:type="dxa"/>
+          </w:tcPr>
+          <w:p>
+            <w:r>
+              <w:t xml:space="preserve">Halo Connect </w:t>
+            </w:r>
+          </w:p>
+        </w:tc>
+        <w:tc>
+          <w:tcPr>
+            <w:tcW w:w="849" w:type="dxa"/>
           </w:tcPr>
           <w:p/>
         </w:tc>
         <w:tc>
           <w:tcPr>
-            <w:tcW w:w="1417" w:type="dxa"/>
-          </w:tcPr>
-          <w:p>
-            <w:r>
-              <w:t xml:space="preserve">The test harness </w:t>
-            </w:r>
-            <w:r>
-              <w:t>shall simulate Best Practice integration through Halo Connect</w:t>
-            </w:r>
-            <w:r>
-              <w:t xml:space="preserve"> exposing FHIR compliant interfaces.</w:t>
-            </w:r>
-          </w:p>
-        </w:tc>
-        <w:tc>
-          <w:tcPr>
-            <w:tcW w:w="1691" w:type="dxa"/>
-          </w:tcPr>
-          <w:p>
-            <w:r>
-              <w:t xml:space="preserve">Halo Connect </w:t>
-            </w:r>
-          </w:p>
-        </w:tc>
-        <w:tc>
-          <w:tcPr>
-            <w:tcW w:w="858" w:type="dxa"/>
-          </w:tcPr>
-          <w:p/>
-        </w:tc>
-        <w:tc>
-          <w:tcPr>
-            <w:tcW w:w="943" w:type="dxa"/>
+            <w:tcW w:w="932" w:type="dxa"/>
           </w:tcPr>
           <w:p>
             <w:r>
@@ -1778,7 +1785,7 @@
         </w:tc>
         <w:tc>
           <w:tcPr>
-            <w:tcW w:w="1478" w:type="dxa"/>
+            <w:tcW w:w="1459" w:type="dxa"/>
           </w:tcPr>
           <w:p>
             <w:r>
@@ -1797,7 +1804,7 @@
         </w:tc>
         <w:tc>
           <w:tcPr>
-            <w:tcW w:w="876" w:type="dxa"/>
+            <w:tcW w:w="867" w:type="dxa"/>
           </w:tcPr>
           <w:p>
             <w:r>
@@ -1807,7 +1814,7 @@
         </w:tc>
         <w:tc>
           <w:tcPr>
-            <w:tcW w:w="1201" w:type="dxa"/>
+            <w:tcW w:w="1186" w:type="dxa"/>
           </w:tcPr>
           <w:p/>
         </w:tc>
@@ -1815,57 +1822,64 @@
       <w:tr>
         <w:tc>
           <w:tcPr>
-            <w:tcW w:w="552" w:type="dxa"/>
+            <w:tcW w:w="654" w:type="dxa"/>
+          </w:tcPr>
+          <w:p>
+            <w:r>
+              <w:t>FR</w:t>
+            </w:r>
+            <w:r>
+              <w:t>3</w:t>
+            </w:r>
+          </w:p>
+        </w:tc>
+        <w:tc>
+          <w:tcPr>
+            <w:tcW w:w="1400" w:type="dxa"/>
+          </w:tcPr>
+          <w:p>
+            <w:r>
+              <w:t>The test harness shall source a set of synthetic</w:t>
+            </w:r>
+            <w:r>
+              <w:t xml:space="preserve"> patient records coded using</w:t>
+            </w:r>
+            <w:r>
+              <w:t xml:space="preserve"> SNOMED CT-AU</w:t>
+            </w:r>
+            <w:r>
+              <w:t xml:space="preserve"> </w:t>
+            </w:r>
+          </w:p>
+        </w:tc>
+        <w:tc>
+          <w:tcPr>
+            <w:tcW w:w="1669" w:type="dxa"/>
+          </w:tcPr>
+          <w:p>
+            <w:r>
+              <w:t>Test harness (Data generator</w:t>
+            </w:r>
+            <w:r>
+              <w:t xml:space="preserve"> </w:t>
+            </w:r>
+            <w:r>
+              <w:t>e.g. synthea</w:t>
+            </w:r>
+            <w:r>
+              <w:t>)</w:t>
+            </w:r>
+          </w:p>
+        </w:tc>
+        <w:tc>
+          <w:tcPr>
+            <w:tcW w:w="849" w:type="dxa"/>
           </w:tcPr>
           <w:p/>
         </w:tc>
         <w:tc>
           <w:tcPr>
-            <w:tcW w:w="1417" w:type="dxa"/>
-          </w:tcPr>
-          <w:p>
-            <w:r>
-              <w:t>The test harness shall source a set of synthetic</w:t>
-            </w:r>
-            <w:r>
-              <w:t xml:space="preserve"> patient records coded using</w:t>
-            </w:r>
-            <w:r>
-              <w:t xml:space="preserve"> SNOMED CT-AU</w:t>
-            </w:r>
-            <w:r>
-              <w:t xml:space="preserve"> </w:t>
-            </w:r>
-          </w:p>
-        </w:tc>
-        <w:tc>
-          <w:tcPr>
-            <w:tcW w:w="1691" w:type="dxa"/>
-          </w:tcPr>
-          <w:p>
-            <w:r>
-              <w:t>Test harness (Data generator</w:t>
-            </w:r>
-            <w:r>
-              <w:t xml:space="preserve"> </w:t>
-            </w:r>
-            <w:r>
-              <w:t>e.g. synthea</w:t>
-            </w:r>
-            <w:r>
-              <w:t>)</w:t>
-            </w:r>
-          </w:p>
-        </w:tc>
-        <w:tc>
-          <w:tcPr>
-            <w:tcW w:w="858" w:type="dxa"/>
-          </w:tcPr>
-          <w:p/>
-        </w:tc>
-        <w:tc>
-          <w:tcPr>
-            <w:tcW w:w="943" w:type="dxa"/>
+            <w:tcW w:w="932" w:type="dxa"/>
           </w:tcPr>
           <w:p>
             <w:r>
@@ -1875,7 +1889,7 @@
         </w:tc>
         <w:tc>
           <w:tcPr>
-            <w:tcW w:w="1478" w:type="dxa"/>
+            <w:tcW w:w="1459" w:type="dxa"/>
           </w:tcPr>
           <w:p>
             <w:r>
@@ -1899,7 +1913,7 @@
         </w:tc>
         <w:tc>
           <w:tcPr>
-            <w:tcW w:w="876" w:type="dxa"/>
+            <w:tcW w:w="867" w:type="dxa"/>
           </w:tcPr>
           <w:p>
             <w:r>
@@ -1909,7 +1923,7 @@
         </w:tc>
         <w:tc>
           <w:tcPr>
-            <w:tcW w:w="1201" w:type="dxa"/>
+            <w:tcW w:w="1186" w:type="dxa"/>
           </w:tcPr>
           <w:p/>
         </w:tc>
@@ -1917,96 +1931,103 @@
       <w:tr>
         <w:tc>
           <w:tcPr>
-            <w:tcW w:w="552" w:type="dxa"/>
+            <w:tcW w:w="654" w:type="dxa"/>
+          </w:tcPr>
+          <w:p>
+            <w:r>
+              <w:t>FR</w:t>
+            </w:r>
+            <w:r>
+              <w:t>4</w:t>
+            </w:r>
+          </w:p>
+        </w:tc>
+        <w:tc>
+          <w:tcPr>
+            <w:tcW w:w="1400" w:type="dxa"/>
+          </w:tcPr>
+          <w:p>
+            <w:r>
+              <w:rPr>
+                <w:lang w:val="en-AU"/>
+              </w:rPr>
+              <w:t xml:space="preserve">The </w:t>
+            </w:r>
+            <w:r>
+              <w:rPr>
+                <w:lang w:val="en-AU"/>
+              </w:rPr>
+              <w:t>test harness</w:t>
+            </w:r>
+            <w:r>
+              <w:rPr>
+                <w:lang w:val="en-AU"/>
+              </w:rPr>
+              <w:t xml:space="preserve"> shall load synthetic patient records into the test environment.</w:t>
+            </w:r>
+          </w:p>
+        </w:tc>
+        <w:tc>
+          <w:tcPr>
+            <w:tcW w:w="1669" w:type="dxa"/>
+          </w:tcPr>
+          <w:p>
+            <w:r>
+              <w:rPr>
+                <w:lang w:val="en-AU"/>
+              </w:rPr>
+              <w:t>Test Harness</w:t>
+            </w:r>
+          </w:p>
+        </w:tc>
+        <w:tc>
+          <w:tcPr>
+            <w:tcW w:w="849" w:type="dxa"/>
           </w:tcPr>
           <w:p/>
         </w:tc>
         <w:tc>
           <w:tcPr>
-            <w:tcW w:w="1417" w:type="dxa"/>
+            <w:tcW w:w="932" w:type="dxa"/>
           </w:tcPr>
           <w:p>
             <w:r>
               <w:rPr>
                 <w:lang w:val="en-AU"/>
               </w:rPr>
-              <w:t xml:space="preserve">The </w:t>
-            </w:r>
+              <w:t>High</w:t>
+            </w:r>
+          </w:p>
+        </w:tc>
+        <w:tc>
+          <w:tcPr>
+            <w:tcW w:w="1459" w:type="dxa"/>
+          </w:tcPr>
+          <w:p>
             <w:r>
               <w:rPr>
                 <w:lang w:val="en-AU"/>
               </w:rPr>
-              <w:t>test harness</w:t>
-            </w:r>
+              <w:t>Synthetic patient records are successfully loaded and retrievable.</w:t>
+            </w:r>
+          </w:p>
+        </w:tc>
+        <w:tc>
+          <w:tcPr>
+            <w:tcW w:w="867" w:type="dxa"/>
+          </w:tcPr>
+          <w:p>
             <w:r>
               <w:rPr>
                 <w:lang w:val="en-AU"/>
               </w:rPr>
-              <w:t xml:space="preserve"> shall load synthetic patient records into the test environment.</w:t>
-            </w:r>
-          </w:p>
-        </w:tc>
-        <w:tc>
-          <w:tcPr>
-            <w:tcW w:w="1691" w:type="dxa"/>
-          </w:tcPr>
-          <w:p>
-            <w:r>
-              <w:rPr>
-                <w:lang w:val="en-AU"/>
-              </w:rPr>
-              <w:t>Test Harness</w:t>
-            </w:r>
-          </w:p>
-        </w:tc>
-        <w:tc>
-          <w:tcPr>
-            <w:tcW w:w="858" w:type="dxa"/>
-          </w:tcPr>
-          <w:p/>
-        </w:tc>
-        <w:tc>
-          <w:tcPr>
-            <w:tcW w:w="943" w:type="dxa"/>
-          </w:tcPr>
-          <w:p>
-            <w:r>
-              <w:rPr>
-                <w:lang w:val="en-AU"/>
-              </w:rPr>
-              <w:t>High</w:t>
-            </w:r>
-          </w:p>
-        </w:tc>
-        <w:tc>
-          <w:tcPr>
-            <w:tcW w:w="1478" w:type="dxa"/>
-          </w:tcPr>
-          <w:p>
-            <w:r>
-              <w:rPr>
-                <w:lang w:val="en-AU"/>
-              </w:rPr>
-              <w:t>Synthetic patient records are successfully loaded and retrievable.</w:t>
-            </w:r>
-          </w:p>
-        </w:tc>
-        <w:tc>
-          <w:tcPr>
-            <w:tcW w:w="876" w:type="dxa"/>
-          </w:tcPr>
-          <w:p>
-            <w:r>
-              <w:rPr>
-                <w:lang w:val="en-AU"/>
-              </w:rPr>
               <w:t>Project brief</w:t>
             </w:r>
           </w:p>
         </w:tc>
         <w:tc>
           <w:tcPr>
-            <w:tcW w:w="1201" w:type="dxa"/>
+            <w:tcW w:w="1186" w:type="dxa"/>
           </w:tcPr>
           <w:p>
             <w:r>
@@ -2021,13 +2042,13 @@
       <w:tr>
         <w:tc>
           <w:tcPr>
-            <w:tcW w:w="552" w:type="dxa"/>
+            <w:tcW w:w="654" w:type="dxa"/>
           </w:tcPr>
           <w:p/>
         </w:tc>
         <w:tc>
           <w:tcPr>
-            <w:tcW w:w="1417" w:type="dxa"/>
+            <w:tcW w:w="1400" w:type="dxa"/>
           </w:tcPr>
           <w:p>
             <w:r>
@@ -2049,7 +2070,7 @@
         </w:tc>
         <w:tc>
           <w:tcPr>
-            <w:tcW w:w="1691" w:type="dxa"/>
+            <w:tcW w:w="1669" w:type="dxa"/>
           </w:tcPr>
           <w:p>
             <w:r>
@@ -2059,19 +2080,19 @@
         </w:tc>
         <w:tc>
           <w:tcPr>
-            <w:tcW w:w="858" w:type="dxa"/>
+            <w:tcW w:w="849" w:type="dxa"/>
           </w:tcPr>
           <w:p/>
         </w:tc>
         <w:tc>
           <w:tcPr>
-            <w:tcW w:w="943" w:type="dxa"/>
+            <w:tcW w:w="932" w:type="dxa"/>
           </w:tcPr>
           <w:p/>
         </w:tc>
         <w:tc>
           <w:tcPr>
-            <w:tcW w:w="1478" w:type="dxa"/>
+            <w:tcW w:w="1459" w:type="dxa"/>
           </w:tcPr>
           <w:p>
             <w:r>
@@ -2087,7 +2108,7 @@
         </w:tc>
         <w:tc>
           <w:tcPr>
-            <w:tcW w:w="876" w:type="dxa"/>
+            <w:tcW w:w="867" w:type="dxa"/>
           </w:tcPr>
           <w:p>
             <w:r>
@@ -2097,7 +2118,7 @@
         </w:tc>
         <w:tc>
           <w:tcPr>
-            <w:tcW w:w="1201" w:type="dxa"/>
+            <w:tcW w:w="1186" w:type="dxa"/>
           </w:tcPr>
           <w:p/>
         </w:tc>
@@ -2105,48 +2126,55 @@
       <w:tr>
         <w:tc>
           <w:tcPr>
-            <w:tcW w:w="552" w:type="dxa"/>
+            <w:tcW w:w="654" w:type="dxa"/>
+          </w:tcPr>
+          <w:p>
+            <w:r>
+              <w:t>FR</w:t>
+            </w:r>
+            <w:r>
+              <w:t>5</w:t>
+            </w:r>
+          </w:p>
+        </w:tc>
+        <w:tc>
+          <w:tcPr>
+            <w:tcW w:w="1400" w:type="dxa"/>
+          </w:tcPr>
+          <w:p>
+            <w:r>
+              <w:t>The test harness shall test the mapping of SNOMED CT_AU concepts to ICD-10</w:t>
+            </w:r>
+            <w:r>
+              <w:t>AM diagnosis codes</w:t>
+            </w:r>
+            <w:r>
+              <w:t xml:space="preserve"> including edge cases like </w:t>
+            </w:r>
+            <w:r>
+              <w:t>ambiguous or unmapped codes.</w:t>
+            </w:r>
+          </w:p>
+        </w:tc>
+        <w:tc>
+          <w:tcPr>
+            <w:tcW w:w="1669" w:type="dxa"/>
+          </w:tcPr>
+          <w:p>
+            <w:r>
+              <w:t>Test harness (mapping Module)</w:t>
+            </w:r>
+          </w:p>
+        </w:tc>
+        <w:tc>
+          <w:tcPr>
+            <w:tcW w:w="849" w:type="dxa"/>
           </w:tcPr>
           <w:p/>
         </w:tc>
         <w:tc>
           <w:tcPr>
-            <w:tcW w:w="1417" w:type="dxa"/>
-          </w:tcPr>
-          <w:p>
-            <w:r>
-              <w:t>The test harness shall test the mapping of SNOMED CT_AU concepts to ICD-10</w:t>
-            </w:r>
-            <w:r>
-              <w:t>AM diagnosis codes</w:t>
-            </w:r>
-            <w:r>
-              <w:t xml:space="preserve"> including edge cases like </w:t>
-            </w:r>
-            <w:r>
-              <w:t>ambiguous or unmapped codes.</w:t>
-            </w:r>
-          </w:p>
-        </w:tc>
-        <w:tc>
-          <w:tcPr>
-            <w:tcW w:w="1691" w:type="dxa"/>
-          </w:tcPr>
-          <w:p>
-            <w:r>
-              <w:t>Test harness (mapping Module)</w:t>
-            </w:r>
-          </w:p>
-        </w:tc>
-        <w:tc>
-          <w:tcPr>
-            <w:tcW w:w="858" w:type="dxa"/>
-          </w:tcPr>
-          <w:p/>
-        </w:tc>
-        <w:tc>
-          <w:tcPr>
-            <w:tcW w:w="943" w:type="dxa"/>
+            <w:tcW w:w="932" w:type="dxa"/>
           </w:tcPr>
           <w:p>
             <w:r>
@@ -2156,7 +2184,7 @@
         </w:tc>
         <w:tc>
           <w:tcPr>
-            <w:tcW w:w="1478" w:type="dxa"/>
+            <w:tcW w:w="1459" w:type="dxa"/>
           </w:tcPr>
           <w:p>
             <w:r>
@@ -2172,7 +2200,7 @@
         </w:tc>
         <w:tc>
           <w:tcPr>
-            <w:tcW w:w="876" w:type="dxa"/>
+            <w:tcW w:w="867" w:type="dxa"/>
           </w:tcPr>
           <w:p>
             <w:r>
@@ -2182,7 +2210,7 @@
         </w:tc>
         <w:tc>
           <w:tcPr>
-            <w:tcW w:w="1201" w:type="dxa"/>
+            <w:tcW w:w="1186" w:type="dxa"/>
           </w:tcPr>
           <w:p/>
         </w:tc>
@@ -2190,39 +2218,46 @@
       <w:tr>
         <w:tc>
           <w:tcPr>
-            <w:tcW w:w="552" w:type="dxa"/>
+            <w:tcW w:w="654" w:type="dxa"/>
+          </w:tcPr>
+          <w:p>
+            <w:r>
+              <w:t>FR</w:t>
+            </w:r>
+            <w:r>
+              <w:t>6</w:t>
+            </w:r>
+          </w:p>
+        </w:tc>
+        <w:tc>
+          <w:tcPr>
+            <w:tcW w:w="1400" w:type="dxa"/>
+          </w:tcPr>
+          <w:p>
+            <w:r>
+              <w:t>The test harness shall test the mapping of SNOMED CT-AU concepts to MBS billing codes including edge cases.</w:t>
+            </w:r>
+          </w:p>
+        </w:tc>
+        <w:tc>
+          <w:tcPr>
+            <w:tcW w:w="1669" w:type="dxa"/>
+          </w:tcPr>
+          <w:p>
+            <w:r>
+              <w:t>Test harness (mapping Module)</w:t>
+            </w:r>
+          </w:p>
+        </w:tc>
+        <w:tc>
+          <w:tcPr>
+            <w:tcW w:w="849" w:type="dxa"/>
           </w:tcPr>
           <w:p/>
         </w:tc>
         <w:tc>
           <w:tcPr>
-            <w:tcW w:w="1417" w:type="dxa"/>
-          </w:tcPr>
-          <w:p>
-            <w:r>
-              <w:t>The test harness shall test the mapping of SNOMED CT-AU concepts to MBS billing codes including edge cases.</w:t>
-            </w:r>
-          </w:p>
-        </w:tc>
-        <w:tc>
-          <w:tcPr>
-            <w:tcW w:w="1691" w:type="dxa"/>
-          </w:tcPr>
-          <w:p>
-            <w:r>
-              <w:t>Test harness (mapping Module)</w:t>
-            </w:r>
-          </w:p>
-        </w:tc>
-        <w:tc>
-          <w:tcPr>
-            <w:tcW w:w="858" w:type="dxa"/>
-          </w:tcPr>
-          <w:p/>
-        </w:tc>
-        <w:tc>
-          <w:tcPr>
-            <w:tcW w:w="943" w:type="dxa"/>
+            <w:tcW w:w="932" w:type="dxa"/>
           </w:tcPr>
           <w:p>
             <w:r>
@@ -2232,7 +2267,7 @@
         </w:tc>
         <w:tc>
           <w:tcPr>
-            <w:tcW w:w="1478" w:type="dxa"/>
+            <w:tcW w:w="1459" w:type="dxa"/>
           </w:tcPr>
           <w:p>
             <w:r>
@@ -2251,7 +2286,7 @@
         </w:tc>
         <w:tc>
           <w:tcPr>
-            <w:tcW w:w="876" w:type="dxa"/>
+            <w:tcW w:w="867" w:type="dxa"/>
           </w:tcPr>
           <w:p>
             <w:r>
@@ -2261,7 +2296,7 @@
         </w:tc>
         <w:tc>
           <w:tcPr>
-            <w:tcW w:w="1201" w:type="dxa"/>
+            <w:tcW w:w="1186" w:type="dxa"/>
           </w:tcPr>
           <w:p/>
         </w:tc>
@@ -2269,48 +2304,60 @@
       <w:tr>
         <w:tc>
           <w:tcPr>
-            <w:tcW w:w="552" w:type="dxa"/>
+            <w:tcW w:w="654" w:type="dxa"/>
+          </w:tcPr>
+          <w:p>
+            <w:r>
+              <w:t>FR</w:t>
+            </w:r>
+            <w:r>
+              <w:t>7</w:t>
+            </w:r>
+          </w:p>
+        </w:tc>
+        <w:tc>
+          <w:tcPr>
+            <w:tcW w:w="1400" w:type="dxa"/>
+          </w:tcPr>
+          <w:p>
+            <w:r>
+              <w:t xml:space="preserve">The test harness shall simulate invalid or malformed clinical data </w:t>
+            </w:r>
+            <w:r>
+              <w:lastRenderedPageBreak/>
+              <w:t>to validate the records.</w:t>
+            </w:r>
+          </w:p>
+        </w:tc>
+        <w:tc>
+          <w:tcPr>
+            <w:tcW w:w="1669" w:type="dxa"/>
+          </w:tcPr>
+          <w:p>
+            <w:r>
+              <w:lastRenderedPageBreak/>
+              <w:t>Test harness (</w:t>
+            </w:r>
+            <w:r>
+              <w:t xml:space="preserve">fault injection e.g. </w:t>
+            </w:r>
+            <w:r>
+              <w:t xml:space="preserve"> incorrect clinical record</w:t>
+            </w:r>
+            <w:r>
+              <w:t>)</w:t>
+            </w:r>
+          </w:p>
+        </w:tc>
+        <w:tc>
+          <w:tcPr>
+            <w:tcW w:w="849" w:type="dxa"/>
           </w:tcPr>
           <w:p/>
         </w:tc>
         <w:tc>
           <w:tcPr>
-            <w:tcW w:w="1417" w:type="dxa"/>
-          </w:tcPr>
-          <w:p>
-            <w:r>
-              <w:t>The test harness shall simulate invalid or malformed clinical data to validate the records.</w:t>
-            </w:r>
-          </w:p>
-        </w:tc>
-        <w:tc>
-          <w:tcPr>
-            <w:tcW w:w="1691" w:type="dxa"/>
-          </w:tcPr>
-          <w:p>
-            <w:r>
-              <w:t>Test harness (</w:t>
-            </w:r>
-            <w:r>
-              <w:t xml:space="preserve">fault injection e.g. </w:t>
-            </w:r>
-            <w:r>
-              <w:t xml:space="preserve"> incorrect clinical record</w:t>
-            </w:r>
-            <w:r>
-              <w:t>)</w:t>
-            </w:r>
-          </w:p>
-        </w:tc>
-        <w:tc>
-          <w:tcPr>
-            <w:tcW w:w="858" w:type="dxa"/>
-          </w:tcPr>
-          <w:p/>
-        </w:tc>
-        <w:tc>
-          <w:tcPr>
-            <w:tcW w:w="943" w:type="dxa"/>
+            <w:tcW w:w="932" w:type="dxa"/>
           </w:tcPr>
           <w:p>
             <w:r>
@@ -2320,14 +2367,18 @@
         </w:tc>
         <w:tc>
           <w:tcPr>
-            <w:tcW w:w="1478" w:type="dxa"/>
+            <w:tcW w:w="1459" w:type="dxa"/>
           </w:tcPr>
           <w:p>
             <w:r>
               <w:t>Malformed data sent to the synthetic environment</w:t>
             </w:r>
             <w:r>
-              <w:t xml:space="preserve"> triggers expected error/rejection response </w:t>
+              <w:t xml:space="preserve"> triggers expected error/rejectio</w:t>
+            </w:r>
+            <w:r>
+              <w:lastRenderedPageBreak/>
+              <w:t xml:space="preserve">n response </w:t>
             </w:r>
             <w:r>
               <w:t>and reason.</w:t>
@@ -2336,17 +2387,18 @@
         </w:tc>
         <w:tc>
           <w:tcPr>
-            <w:tcW w:w="876" w:type="dxa"/>
-          </w:tcPr>
-          <w:p>
-            <w:r>
+            <w:tcW w:w="867" w:type="dxa"/>
+          </w:tcPr>
+          <w:p>
+            <w:r>
+              <w:lastRenderedPageBreak/>
               <w:t>Project brief</w:t>
             </w:r>
           </w:p>
         </w:tc>
         <w:tc>
           <w:tcPr>
-            <w:tcW w:w="1201" w:type="dxa"/>
+            <w:tcW w:w="1186" w:type="dxa"/>
           </w:tcPr>
           <w:p/>
         </w:tc>
@@ -2354,71 +2406,63 @@
       <w:tr>
         <w:tc>
           <w:tcPr>
-            <w:tcW w:w="552" w:type="dxa"/>
+            <w:tcW w:w="654" w:type="dxa"/>
+          </w:tcPr>
+          <w:p>
+            <w:r>
+              <w:t>FR8</w:t>
+            </w:r>
+          </w:p>
+        </w:tc>
+        <w:tc>
+          <w:tcPr>
+            <w:tcW w:w="1400" w:type="dxa"/>
+          </w:tcPr>
+          <w:p>
+            <w:r>
+              <w:t>The test harness shall simulate slow/delayed responses from an external clinical system.</w:t>
+            </w:r>
+          </w:p>
+        </w:tc>
+        <w:tc>
+          <w:tcPr>
+            <w:tcW w:w="1669" w:type="dxa"/>
+          </w:tcPr>
+          <w:p>
+            <w:r>
+              <w:t>Test harness (fault injection)</w:t>
+            </w:r>
+          </w:p>
+        </w:tc>
+        <w:tc>
+          <w:tcPr>
+            <w:tcW w:w="849" w:type="dxa"/>
           </w:tcPr>
           <w:p/>
         </w:tc>
         <w:tc>
           <w:tcPr>
-            <w:tcW w:w="1417" w:type="dxa"/>
-          </w:tcPr>
-          <w:p>
-            <w:r>
-              <w:t>The test harness shall simulate slow/delayed responses from an external clinical system.</w:t>
-            </w:r>
-          </w:p>
-        </w:tc>
-        <w:tc>
-          <w:tcPr>
-            <w:tcW w:w="1691" w:type="dxa"/>
-          </w:tcPr>
-          <w:p>
-            <w:r>
-              <w:t>Test harness (fault injection</w:t>
-            </w:r>
-            <w:r>
-              <w:t>)</w:t>
-            </w:r>
-          </w:p>
-        </w:tc>
-        <w:tc>
-          <w:tcPr>
-            <w:tcW w:w="858" w:type="dxa"/>
-          </w:tcPr>
-          <w:p/>
-        </w:tc>
-        <w:tc>
-          <w:tcPr>
-            <w:tcW w:w="943" w:type="dxa"/>
-          </w:tcPr>
-          <w:p>
-            <w:r>
-              <w:t>mediu</w:t>
-            </w:r>
-            <w:r>
-              <w:t>m</w:t>
-            </w:r>
-          </w:p>
-        </w:tc>
-        <w:tc>
-          <w:tcPr>
-            <w:tcW w:w="1478" w:type="dxa"/>
-          </w:tcPr>
-          <w:p>
-            <w:r>
-              <w:t>Simulated delay triggers</w:t>
-            </w:r>
-            <w:r>
-              <w:t xml:space="preserve"> timeout/retry behavior to be defined in t</w:t>
-            </w:r>
-            <w:r>
-              <w:t>est plan.</w:t>
-            </w:r>
-          </w:p>
-        </w:tc>
-        <w:tc>
-          <w:tcPr>
-            <w:tcW w:w="876" w:type="dxa"/>
+            <w:tcW w:w="932" w:type="dxa"/>
+          </w:tcPr>
+          <w:p>
+            <w:r>
+              <w:t>medium</w:t>
+            </w:r>
+          </w:p>
+        </w:tc>
+        <w:tc>
+          <w:tcPr>
+            <w:tcW w:w="1459" w:type="dxa"/>
+          </w:tcPr>
+          <w:p>
+            <w:r>
+              <w:t>Simulated delay triggers timeout/retry behavior to be defined in test plan.</w:t>
+            </w:r>
+          </w:p>
+        </w:tc>
+        <w:tc>
+          <w:tcPr>
+            <w:tcW w:w="867" w:type="dxa"/>
           </w:tcPr>
           <w:p>
             <w:r>
@@ -2428,7 +2472,7 @@
         </w:tc>
         <w:tc>
           <w:tcPr>
-            <w:tcW w:w="1201" w:type="dxa"/>
+            <w:tcW w:w="1186" w:type="dxa"/>
           </w:tcPr>
           <w:p/>
         </w:tc>
@@ -2436,61 +2480,59 @@
       <w:tr>
         <w:tc>
           <w:tcPr>
-            <w:tcW w:w="552" w:type="dxa"/>
+            <w:tcW w:w="654" w:type="dxa"/>
+          </w:tcPr>
+          <w:p>
+            <w:r>
+              <w:t>FR9</w:t>
+            </w:r>
+          </w:p>
+        </w:tc>
+        <w:tc>
+          <w:tcPr>
+            <w:tcW w:w="1400" w:type="dxa"/>
+          </w:tcPr>
+          <w:p>
+            <w:r>
+              <w:t>The test harness shall simulate a dropped connection during data exchange.</w:t>
+            </w:r>
+          </w:p>
+        </w:tc>
+        <w:tc>
+          <w:tcPr>
+            <w:tcW w:w="1669" w:type="dxa"/>
+          </w:tcPr>
+          <w:p>
+            <w:r>
+              <w:t>Test harness (fault injection)</w:t>
+            </w:r>
+          </w:p>
+        </w:tc>
+        <w:tc>
+          <w:tcPr>
+            <w:tcW w:w="849" w:type="dxa"/>
           </w:tcPr>
           <w:p/>
         </w:tc>
         <w:tc>
           <w:tcPr>
-            <w:tcW w:w="1417" w:type="dxa"/>
-          </w:tcPr>
-          <w:p>
-            <w:r>
-              <w:t>The test harness shall simulate a dropped connection during data exchange.</w:t>
-            </w:r>
-          </w:p>
-        </w:tc>
-        <w:tc>
-          <w:tcPr>
-            <w:tcW w:w="1691" w:type="dxa"/>
-          </w:tcPr>
-          <w:p>
-            <w:r>
-              <w:t>Test harness (fault injection)</w:t>
-            </w:r>
-          </w:p>
-        </w:tc>
-        <w:tc>
-          <w:tcPr>
-            <w:tcW w:w="858" w:type="dxa"/>
+            <w:tcW w:w="932" w:type="dxa"/>
           </w:tcPr>
           <w:p/>
         </w:tc>
         <w:tc>
           <w:tcPr>
-            <w:tcW w:w="943" w:type="dxa"/>
-          </w:tcPr>
-          <w:p/>
-        </w:tc>
-        <w:tc>
-          <w:tcPr>
-            <w:tcW w:w="1478" w:type="dxa"/>
-          </w:tcPr>
-          <w:p>
-            <w:r>
-              <w:t>Simulated disconnection</w:t>
-            </w:r>
-            <w:r>
-              <w:t xml:space="preserve"> triggers </w:t>
-            </w:r>
-            <w:r>
-              <w:t>expected recovery/error logging behavior.</w:t>
-            </w:r>
-          </w:p>
-        </w:tc>
-        <w:tc>
-          <w:tcPr>
-            <w:tcW w:w="876" w:type="dxa"/>
+            <w:tcW w:w="1459" w:type="dxa"/>
+          </w:tcPr>
+          <w:p>
+            <w:r>
+              <w:t>Simulated disconnection triggers expected recovery/error logging behavior.</w:t>
+            </w:r>
+          </w:p>
+        </w:tc>
+        <w:tc>
+          <w:tcPr>
+            <w:tcW w:w="867" w:type="dxa"/>
           </w:tcPr>
           <w:p>
             <w:r>
@@ -2500,7 +2542,7 @@
         </w:tc>
         <w:tc>
           <w:tcPr>
-            <w:tcW w:w="1201" w:type="dxa"/>
+            <w:tcW w:w="1186" w:type="dxa"/>
           </w:tcPr>
           <w:p/>
         </w:tc>
@@ -2508,39 +2550,43 @@
       <w:tr>
         <w:tc>
           <w:tcPr>
-            <w:tcW w:w="552" w:type="dxa"/>
+            <w:tcW w:w="654" w:type="dxa"/>
+          </w:tcPr>
+          <w:p>
+            <w:r>
+              <w:t>FR10</w:t>
+            </w:r>
+          </w:p>
+        </w:tc>
+        <w:tc>
+          <w:tcPr>
+            <w:tcW w:w="1400" w:type="dxa"/>
+          </w:tcPr>
+          <w:p>
+            <w:r>
+              <w:t xml:space="preserve">The test harness shall automatically record the result of each test and mark it as passed or failed. </w:t>
+            </w:r>
+          </w:p>
+        </w:tc>
+        <w:tc>
+          <w:tcPr>
+            <w:tcW w:w="1669" w:type="dxa"/>
+          </w:tcPr>
+          <w:p>
+            <w:r>
+              <w:t>Test harness (Test run)</w:t>
+            </w:r>
+          </w:p>
+        </w:tc>
+        <w:tc>
+          <w:tcPr>
+            <w:tcW w:w="849" w:type="dxa"/>
           </w:tcPr>
           <w:p/>
         </w:tc>
         <w:tc>
           <w:tcPr>
-            <w:tcW w:w="1417" w:type="dxa"/>
-          </w:tcPr>
-          <w:p>
-            <w:r>
-              <w:t xml:space="preserve">The test harness shall automatically record the result of each test and mark it as passed or failed. </w:t>
-            </w:r>
-          </w:p>
-        </w:tc>
-        <w:tc>
-          <w:tcPr>
-            <w:tcW w:w="1691" w:type="dxa"/>
-          </w:tcPr>
-          <w:p>
-            <w:r>
-              <w:t>Test harness (Test run)</w:t>
-            </w:r>
-          </w:p>
-        </w:tc>
-        <w:tc>
-          <w:tcPr>
-            <w:tcW w:w="858" w:type="dxa"/>
-          </w:tcPr>
-          <w:p/>
-        </w:tc>
-        <w:tc>
-          <w:tcPr>
-            <w:tcW w:w="943" w:type="dxa"/>
+            <w:tcW w:w="932" w:type="dxa"/>
           </w:tcPr>
           <w:p>
             <w:r>
@@ -2550,7 +2596,7 @@
         </w:tc>
         <w:tc>
           <w:tcPr>
-            <w:tcW w:w="1478" w:type="dxa"/>
+            <w:tcW w:w="1459" w:type="dxa"/>
           </w:tcPr>
           <w:p>
             <w:r>
@@ -2560,7 +2606,7 @@
         </w:tc>
         <w:tc>
           <w:tcPr>
-            <w:tcW w:w="876" w:type="dxa"/>
+            <w:tcW w:w="867" w:type="dxa"/>
           </w:tcPr>
           <w:p>
             <w:r>
@@ -2570,7 +2616,7 @@
         </w:tc>
         <w:tc>
           <w:tcPr>
-            <w:tcW w:w="1201" w:type="dxa"/>
+            <w:tcW w:w="1186" w:type="dxa"/>
           </w:tcPr>
           <w:p/>
         </w:tc>
@@ -2578,39 +2624,43 @@
       <w:tr>
         <w:tc>
           <w:tcPr>
-            <w:tcW w:w="552" w:type="dxa"/>
+            <w:tcW w:w="654" w:type="dxa"/>
+          </w:tcPr>
+          <w:p>
+            <w:r>
+              <w:t>FR11</w:t>
+            </w:r>
+          </w:p>
+        </w:tc>
+        <w:tc>
+          <w:tcPr>
+            <w:tcW w:w="1400" w:type="dxa"/>
+          </w:tcPr>
+          <w:p>
+            <w:r>
+              <w:t>The test harness shall record each reason for failed test.</w:t>
+            </w:r>
+          </w:p>
+        </w:tc>
+        <w:tc>
+          <w:tcPr>
+            <w:tcW w:w="1669" w:type="dxa"/>
+          </w:tcPr>
+          <w:p>
+            <w:r>
+              <w:t>Test harness (Test run)</w:t>
+            </w:r>
+          </w:p>
+        </w:tc>
+        <w:tc>
+          <w:tcPr>
+            <w:tcW w:w="849" w:type="dxa"/>
           </w:tcPr>
           <w:p/>
         </w:tc>
         <w:tc>
           <w:tcPr>
-            <w:tcW w:w="1417" w:type="dxa"/>
-          </w:tcPr>
-          <w:p>
-            <w:r>
-              <w:t>The test harness shall record each reason for failed test.</w:t>
-            </w:r>
-          </w:p>
-        </w:tc>
-        <w:tc>
-          <w:tcPr>
-            <w:tcW w:w="1691" w:type="dxa"/>
-          </w:tcPr>
-          <w:p>
-            <w:r>
-              <w:t>Test harness (Test run)</w:t>
-            </w:r>
-          </w:p>
-        </w:tc>
-        <w:tc>
-          <w:tcPr>
-            <w:tcW w:w="858" w:type="dxa"/>
-          </w:tcPr>
-          <w:p/>
-        </w:tc>
-        <w:tc>
-          <w:tcPr>
-            <w:tcW w:w="943" w:type="dxa"/>
+            <w:tcW w:w="932" w:type="dxa"/>
           </w:tcPr>
           <w:p>
             <w:r>
@@ -2620,7 +2670,7 @@
         </w:tc>
         <w:tc>
           <w:tcPr>
-            <w:tcW w:w="1478" w:type="dxa"/>
+            <w:tcW w:w="1459" w:type="dxa"/>
             <w:vAlign w:val="center"/>
           </w:tcPr>
           <w:p>
@@ -2639,7 +2689,7 @@
         </w:tc>
         <w:tc>
           <w:tcPr>
-            <w:tcW w:w="876" w:type="dxa"/>
+            <w:tcW w:w="867" w:type="dxa"/>
           </w:tcPr>
           <w:p>
             <w:r>
@@ -2649,7 +2699,7 @@
         </w:tc>
         <w:tc>
           <w:tcPr>
-            <w:tcW w:w="1201" w:type="dxa"/>
+            <w:tcW w:w="1186" w:type="dxa"/>
           </w:tcPr>
           <w:p/>
         </w:tc>
@@ -2657,39 +2707,46 @@
       <w:tr>
         <w:tc>
           <w:tcPr>
-            <w:tcW w:w="552" w:type="dxa"/>
+            <w:tcW w:w="654" w:type="dxa"/>
+          </w:tcPr>
+          <w:p>
+            <w:r>
+              <w:t>FR1</w:t>
+            </w:r>
+            <w:r>
+              <w:t>2</w:t>
+            </w:r>
+          </w:p>
+        </w:tc>
+        <w:tc>
+          <w:tcPr>
+            <w:tcW w:w="1400" w:type="dxa"/>
+          </w:tcPr>
+          <w:p>
+            <w:r>
+              <w:t xml:space="preserve">The test harness shall generate a report summarizing the test results. </w:t>
+            </w:r>
+          </w:p>
+        </w:tc>
+        <w:tc>
+          <w:tcPr>
+            <w:tcW w:w="1669" w:type="dxa"/>
+          </w:tcPr>
+          <w:p>
+            <w:r>
+              <w:t>Test harness (Reporting Module)</w:t>
+            </w:r>
+          </w:p>
+        </w:tc>
+        <w:tc>
+          <w:tcPr>
+            <w:tcW w:w="849" w:type="dxa"/>
           </w:tcPr>
           <w:p/>
         </w:tc>
         <w:tc>
           <w:tcPr>
-            <w:tcW w:w="1417" w:type="dxa"/>
-          </w:tcPr>
-          <w:p>
-            <w:r>
-              <w:t xml:space="preserve">The test harness shall generate a report summarizing the test results. </w:t>
-            </w:r>
-          </w:p>
-        </w:tc>
-        <w:tc>
-          <w:tcPr>
-            <w:tcW w:w="1691" w:type="dxa"/>
-          </w:tcPr>
-          <w:p>
-            <w:r>
-              <w:t>Test harness (Reporting Module)</w:t>
-            </w:r>
-          </w:p>
-        </w:tc>
-        <w:tc>
-          <w:tcPr>
-            <w:tcW w:w="858" w:type="dxa"/>
-          </w:tcPr>
-          <w:p/>
-        </w:tc>
-        <w:tc>
-          <w:tcPr>
-            <w:tcW w:w="943" w:type="dxa"/>
+            <w:tcW w:w="932" w:type="dxa"/>
           </w:tcPr>
           <w:p>
             <w:r>
@@ -2699,7 +2756,7 @@
         </w:tc>
         <w:tc>
           <w:tcPr>
-            <w:tcW w:w="1478" w:type="dxa"/>
+            <w:tcW w:w="1459" w:type="dxa"/>
             <w:vAlign w:val="center"/>
           </w:tcPr>
           <w:p>
@@ -2710,7 +2767,7 @@
         </w:tc>
         <w:tc>
           <w:tcPr>
-            <w:tcW w:w="876" w:type="dxa"/>
+            <w:tcW w:w="867" w:type="dxa"/>
           </w:tcPr>
           <w:p>
             <w:r>
@@ -2720,12 +2777,1738 @@
         </w:tc>
         <w:tc>
           <w:tcPr>
-            <w:tcW w:w="1201" w:type="dxa"/>
+            <w:tcW w:w="1186" w:type="dxa"/>
           </w:tcPr>
           <w:p/>
         </w:tc>
       </w:tr>
     </w:tbl>
+    <w:p/>
+    <w:p>
+      <w:r>
+        <w:t>3.5 Non-Functional Requirements</w:t>
+      </w:r>
+    </w:p>
+    <w:tbl>
+      <w:tblPr>
+        <w:tblStyle w:val="TableGrid"/>
+        <w:tblW w:w="0" w:type="auto"/>
+        <w:tblLook w:val="04A0" w:firstRow="1" w:lastRow="0" w:firstColumn="1" w:lastColumn="0" w:noHBand="0" w:noVBand="1"/>
+      </w:tblPr>
+      <w:tblGrid>
+        <w:gridCol w:w="661"/>
+        <w:gridCol w:w="2010"/>
+        <w:gridCol w:w="1268"/>
+        <w:gridCol w:w="1634"/>
+        <w:gridCol w:w="1294"/>
+        <w:gridCol w:w="878"/>
+        <w:gridCol w:w="1271"/>
+      </w:tblGrid>
+      <w:tr>
+        <w:tc>
+          <w:tcPr>
+            <w:tcW w:w="682" w:type="dxa"/>
+          </w:tcPr>
+          <w:p>
+            <w:r>
+              <w:t>ID</w:t>
+            </w:r>
+          </w:p>
+        </w:tc>
+        <w:tc>
+          <w:tcPr>
+            <w:tcW w:w="2094" w:type="dxa"/>
+          </w:tcPr>
+          <w:p>
+            <w:r>
+              <w:t>category</w:t>
+            </w:r>
+          </w:p>
+        </w:tc>
+        <w:tc>
+          <w:tcPr>
+            <w:tcW w:w="1317" w:type="dxa"/>
+          </w:tcPr>
+          <w:p>
+            <w:r>
+              <w:t xml:space="preserve">Measurable </w:t>
+            </w:r>
+            <w:r>
+              <w:lastRenderedPageBreak/>
+              <w:t>Requirement</w:t>
+            </w:r>
+          </w:p>
+        </w:tc>
+        <w:tc>
+          <w:tcPr>
+            <w:tcW w:w="1350" w:type="dxa"/>
+          </w:tcPr>
+          <w:p>
+            <w:r>
+              <w:lastRenderedPageBreak/>
+              <w:t>Metric/target</w:t>
+            </w:r>
+          </w:p>
+        </w:tc>
+        <w:tc>
+          <w:tcPr>
+            <w:tcW w:w="1344" w:type="dxa"/>
+          </w:tcPr>
+          <w:p>
+            <w:r>
+              <w:t>Scope</w:t>
+            </w:r>
+          </w:p>
+        </w:tc>
+        <w:tc>
+          <w:tcPr>
+            <w:tcW w:w="909" w:type="dxa"/>
+          </w:tcPr>
+          <w:p>
+            <w:r>
+              <w:t>Priority</w:t>
+            </w:r>
+          </w:p>
+        </w:tc>
+        <w:tc>
+          <w:tcPr>
+            <w:tcW w:w="1320" w:type="dxa"/>
+          </w:tcPr>
+          <w:p>
+            <w:r>
+              <w:t>Source</w:t>
+            </w:r>
+          </w:p>
+        </w:tc>
+      </w:tr>
+      <w:tr>
+        <w:tc>
+          <w:tcPr>
+            <w:tcW w:w="682" w:type="dxa"/>
+          </w:tcPr>
+          <w:p>
+            <w:r>
+              <w:t>NFR 1</w:t>
+            </w:r>
+          </w:p>
+        </w:tc>
+        <w:tc>
+          <w:tcPr>
+            <w:tcW w:w="2094" w:type="dxa"/>
+          </w:tcPr>
+          <w:p>
+            <w:r>
+              <w:t>Security</w:t>
+            </w:r>
+          </w:p>
+        </w:tc>
+        <w:tc>
+          <w:tcPr>
+            <w:tcW w:w="1317" w:type="dxa"/>
+          </w:tcPr>
+          <w:p>
+            <w:r>
+              <w:t>The test harness shall restrict acc</w:t>
+            </w:r>
+            <w:r>
+              <w:t xml:space="preserve">ess to </w:t>
+            </w:r>
+            <w:r>
+              <w:t>authorized test environment users.</w:t>
+            </w:r>
+          </w:p>
+        </w:tc>
+        <w:tc>
+          <w:tcPr>
+            <w:tcW w:w="1350" w:type="dxa"/>
+          </w:tcPr>
+          <w:p>
+            <w:r>
+              <w:t>100%</w:t>
+            </w:r>
+            <w:r>
+              <w:t xml:space="preserve"> unauthorised access attempt rejected.</w:t>
+            </w:r>
+          </w:p>
+        </w:tc>
+        <w:tc>
+          <w:tcPr>
+            <w:tcW w:w="1344" w:type="dxa"/>
+          </w:tcPr>
+          <w:p>
+            <w:r>
+              <w:t xml:space="preserve">Test harness </w:t>
+            </w:r>
+            <w:r>
+              <w:t xml:space="preserve">environment. </w:t>
+            </w:r>
+          </w:p>
+        </w:tc>
+        <w:tc>
+          <w:tcPr>
+            <w:tcW w:w="909" w:type="dxa"/>
+          </w:tcPr>
+          <w:p>
+            <w:r>
+              <w:t>High</w:t>
+            </w:r>
+          </w:p>
+        </w:tc>
+        <w:tc>
+          <w:tcPr>
+            <w:tcW w:w="1320" w:type="dxa"/>
+          </w:tcPr>
+          <w:p>
+            <w:r>
+              <w:t>Project requirement.</w:t>
+            </w:r>
+          </w:p>
+        </w:tc>
+      </w:tr>
+      <w:tr>
+        <w:tc>
+          <w:tcPr>
+            <w:tcW w:w="682" w:type="dxa"/>
+          </w:tcPr>
+          <w:p>
+            <w:r>
+              <w:t>NFR2</w:t>
+            </w:r>
+          </w:p>
+        </w:tc>
+        <w:tc>
+          <w:tcPr>
+            <w:tcW w:w="2094" w:type="dxa"/>
+          </w:tcPr>
+          <w:p>
+            <w:r>
+              <w:t>Privacy</w:t>
+            </w:r>
+          </w:p>
+        </w:tc>
+        <w:tc>
+          <w:tcPr>
+            <w:tcW w:w="1317" w:type="dxa"/>
+          </w:tcPr>
+          <w:p>
+            <w:r>
+              <w:t>The test harness shall only use sy</w:t>
+            </w:r>
+            <w:r>
+              <w:t>nthetic patient data.</w:t>
+            </w:r>
+          </w:p>
+        </w:tc>
+        <w:tc>
+          <w:tcPr>
+            <w:tcW w:w="1350" w:type="dxa"/>
+          </w:tcPr>
+          <w:p>
+            <w:r>
+              <w:t>100% synthetic patient records.</w:t>
+            </w:r>
+          </w:p>
+        </w:tc>
+        <w:tc>
+          <w:tcPr>
+            <w:tcW w:w="1344" w:type="dxa"/>
+          </w:tcPr>
+          <w:p>
+            <w:r>
+              <w:t>Dataset</w:t>
+            </w:r>
+          </w:p>
+        </w:tc>
+        <w:tc>
+          <w:tcPr>
+            <w:tcW w:w="909" w:type="dxa"/>
+          </w:tcPr>
+          <w:p>
+            <w:r>
+              <w:t>High</w:t>
+            </w:r>
+          </w:p>
+        </w:tc>
+        <w:tc>
+          <w:tcPr>
+            <w:tcW w:w="1320" w:type="dxa"/>
+          </w:tcPr>
+          <w:p>
+            <w:r>
+              <w:t>Project brief</w:t>
+            </w:r>
+          </w:p>
+        </w:tc>
+      </w:tr>
+      <w:tr>
+        <w:tc>
+          <w:tcPr>
+            <w:tcW w:w="682" w:type="dxa"/>
+          </w:tcPr>
+          <w:p>
+            <w:r>
+              <w:t>NFR3</w:t>
+            </w:r>
+          </w:p>
+        </w:tc>
+        <w:tc>
+          <w:tcPr>
+            <w:tcW w:w="2094" w:type="dxa"/>
+          </w:tcPr>
+          <w:p>
+            <w:r>
+              <w:t>Compliance</w:t>
+            </w:r>
+          </w:p>
+        </w:tc>
+        <w:tc>
+          <w:tcPr>
+            <w:tcW w:w="1317" w:type="dxa"/>
+          </w:tcPr>
+          <w:p>
+            <w:r>
+              <w:t>The test harness will only use synthetic dataset.</w:t>
+            </w:r>
+          </w:p>
+        </w:tc>
+        <w:tc>
+          <w:tcPr>
+            <w:tcW w:w="1350" w:type="dxa"/>
+          </w:tcPr>
+          <w:p>
+            <w:r>
+              <w:t>100% synthetic patient records</w:t>
+            </w:r>
+            <w:r>
+              <w:t xml:space="preserve"> used or stored during testing</w:t>
+            </w:r>
+            <w:r>
+              <w:t>.</w:t>
+            </w:r>
+          </w:p>
+        </w:tc>
+        <w:tc>
+          <w:tcPr>
+            <w:tcW w:w="1344" w:type="dxa"/>
+          </w:tcPr>
+          <w:p>
+            <w:r>
+              <w:t>Entire Test Environment</w:t>
+            </w:r>
+          </w:p>
+        </w:tc>
+        <w:tc>
+          <w:tcPr>
+            <w:tcW w:w="909" w:type="dxa"/>
+          </w:tcPr>
+          <w:p>
+            <w:r>
+              <w:t>High</w:t>
+            </w:r>
+          </w:p>
+        </w:tc>
+        <w:tc>
+          <w:tcPr>
+            <w:tcW w:w="1320" w:type="dxa"/>
+          </w:tcPr>
+          <w:p>
+            <w:r>
+              <w:t>Project brief</w:t>
+            </w:r>
+          </w:p>
+        </w:tc>
+      </w:tr>
+      <w:tr>
+        <w:tc>
+          <w:tcPr>
+            <w:tcW w:w="682" w:type="dxa"/>
+          </w:tcPr>
+          <w:p>
+            <w:r>
+              <w:t>NFR4</w:t>
+            </w:r>
+          </w:p>
+        </w:tc>
+        <w:tc>
+          <w:tcPr>
+            <w:tcW w:w="2094" w:type="dxa"/>
+          </w:tcPr>
+          <w:p>
+            <w:r>
+              <w:t>Performance</w:t>
+            </w:r>
+          </w:p>
+        </w:tc>
+        <w:tc>
+          <w:tcPr>
+            <w:tcW w:w="1317" w:type="dxa"/>
+          </w:tcPr>
+          <w:p>
+            <w:r>
+              <w:t>The test harness</w:t>
+            </w:r>
+            <w:r>
+              <w:t xml:space="preserve"> shall process standard test </w:t>
+            </w:r>
+            <w:proofErr w:type="gramStart"/>
+            <w:r>
+              <w:t>case</w:t>
+            </w:r>
+            <w:proofErr w:type="gramEnd"/>
+            <w:r>
+              <w:t xml:space="preserve"> within acceptable response time.</w:t>
+            </w:r>
+          </w:p>
+        </w:tc>
+        <w:tc>
+          <w:tcPr>
+            <w:tcW w:w="1350" w:type="dxa"/>
+          </w:tcPr>
+          <w:p>
+            <w:r>
+              <w:t xml:space="preserve">Test results are returned within </w:t>
+            </w:r>
+            <w:r>
+              <w:t xml:space="preserve">5 </w:t>
+            </w:r>
+            <w:r>
+              <w:t>seconds under normal test conditions</w:t>
+            </w:r>
+          </w:p>
+        </w:tc>
+        <w:tc>
+          <w:tcPr>
+            <w:tcW w:w="1344" w:type="dxa"/>
+          </w:tcPr>
+          <w:p>
+            <w:r>
+              <w:t xml:space="preserve">Test </w:t>
+            </w:r>
+            <w:r>
+              <w:t>h</w:t>
+            </w:r>
+            <w:r>
+              <w:t>arness</w:t>
+            </w:r>
+          </w:p>
+        </w:tc>
+        <w:tc>
+          <w:tcPr>
+            <w:tcW w:w="909" w:type="dxa"/>
+          </w:tcPr>
+          <w:p>
+            <w:r>
+              <w:t>Medium</w:t>
+            </w:r>
+          </w:p>
+        </w:tc>
+        <w:tc>
+          <w:tcPr>
+            <w:tcW w:w="1320" w:type="dxa"/>
+          </w:tcPr>
+          <w:p>
+            <w:r>
+              <w:t>Project requirement</w:t>
+            </w:r>
+          </w:p>
+        </w:tc>
+      </w:tr>
+      <w:tr>
+        <w:tc>
+          <w:tcPr>
+            <w:tcW w:w="682" w:type="dxa"/>
+          </w:tcPr>
+          <w:p>
+            <w:r>
+              <w:t>NFR5</w:t>
+            </w:r>
+          </w:p>
+        </w:tc>
+        <w:tc>
+          <w:tcPr>
+            <w:tcW w:w="2094" w:type="dxa"/>
+          </w:tcPr>
+          <w:p>
+            <w:r>
+              <w:t>Reliability</w:t>
+            </w:r>
+            <w:r>
+              <w:t>/ Availability</w:t>
+            </w:r>
+          </w:p>
+        </w:tc>
+        <w:tc>
+          <w:tcPr>
+            <w:tcW w:w="1317" w:type="dxa"/>
+          </w:tcPr>
+          <w:p>
+            <w:r>
+              <w:t xml:space="preserve">The test harness shall </w:t>
+            </w:r>
+            <w:r>
+              <w:t>consistently complete automated tests without unexpected system failures.</w:t>
+            </w:r>
+          </w:p>
+        </w:tc>
+        <w:tc>
+          <w:tcPr>
+            <w:tcW w:w="1350" w:type="dxa"/>
+          </w:tcPr>
+          <w:p>
+            <w:r>
+              <w:t xml:space="preserve">95% of the test </w:t>
+            </w:r>
+            <w:r>
+              <w:t>runs complete successfully.</w:t>
+            </w:r>
+          </w:p>
+        </w:tc>
+        <w:tc>
+          <w:tcPr>
+            <w:tcW w:w="1344" w:type="dxa"/>
+          </w:tcPr>
+          <w:p>
+            <w:r>
+              <w:t xml:space="preserve">Test </w:t>
+            </w:r>
+            <w:r>
+              <w:t>harness</w:t>
+            </w:r>
+          </w:p>
+        </w:tc>
+        <w:tc>
+          <w:tcPr>
+            <w:tcW w:w="909" w:type="dxa"/>
+          </w:tcPr>
+          <w:p>
+            <w:r>
+              <w:t>High</w:t>
+            </w:r>
+          </w:p>
+        </w:tc>
+        <w:tc>
+          <w:tcPr>
+            <w:tcW w:w="1320" w:type="dxa"/>
+          </w:tcPr>
+          <w:p/>
+        </w:tc>
+      </w:tr>
+      <w:tr>
+        <w:tc>
+          <w:tcPr>
+            <w:tcW w:w="682" w:type="dxa"/>
+          </w:tcPr>
+          <w:p>
+            <w:r>
+              <w:t>NFR6</w:t>
+            </w:r>
+          </w:p>
+        </w:tc>
+        <w:tc>
+          <w:tcPr>
+            <w:tcW w:w="2094" w:type="dxa"/>
+          </w:tcPr>
+          <w:p>
+            <w:r>
+              <w:t>Usability/</w:t>
+            </w:r>
+            <w:r>
+              <w:t xml:space="preserve">Accessibility </w:t>
+            </w:r>
+          </w:p>
+        </w:tc>
+        <w:tc>
+          <w:tcPr>
+            <w:tcW w:w="1317" w:type="dxa"/>
+          </w:tcPr>
+          <w:p>
+            <w:r>
+              <w:t xml:space="preserve">The </w:t>
+            </w:r>
+            <w:r>
+              <w:t xml:space="preserve">test harness shall allow the project users to execute </w:t>
+            </w:r>
+            <w:r>
+              <w:lastRenderedPageBreak/>
+              <w:t xml:space="preserve">tests </w:t>
+            </w:r>
+            <w:r>
+              <w:t xml:space="preserve">easily </w:t>
+            </w:r>
+            <w:r>
+              <w:t>and understand results wi</w:t>
+            </w:r>
+            <w:r>
+              <w:t>thout technical knowledge.</w:t>
+            </w:r>
+          </w:p>
+        </w:tc>
+        <w:tc>
+          <w:tcPr>
+            <w:tcW w:w="1350" w:type="dxa"/>
+          </w:tcPr>
+          <w:p>
+            <w:r>
+              <w:lastRenderedPageBreak/>
+              <w:t>Users</w:t>
+            </w:r>
+            <w:r>
+              <w:t xml:space="preserve"> can start</w:t>
+            </w:r>
+            <w:r>
+              <w:t xml:space="preserve"> test run and get results</w:t>
+            </w:r>
+            <w:r>
+              <w:t xml:space="preserve"> with 3 steps. Results report would </w:t>
+            </w:r>
+            <w:r>
+              <w:lastRenderedPageBreak/>
+              <w:t xml:space="preserve">be </w:t>
+            </w:r>
+            <w:r>
+              <w:t>self-descriptive.</w:t>
+            </w:r>
+          </w:p>
+        </w:tc>
+        <w:tc>
+          <w:tcPr>
+            <w:tcW w:w="1344" w:type="dxa"/>
+          </w:tcPr>
+          <w:p>
+            <w:r>
+              <w:lastRenderedPageBreak/>
+              <w:t xml:space="preserve">Test interface and </w:t>
+            </w:r>
+            <w:r>
+              <w:t>Reports</w:t>
+            </w:r>
+          </w:p>
+        </w:tc>
+        <w:tc>
+          <w:tcPr>
+            <w:tcW w:w="909" w:type="dxa"/>
+          </w:tcPr>
+          <w:p>
+            <w:r>
+              <w:t>Medium</w:t>
+            </w:r>
+          </w:p>
+        </w:tc>
+        <w:tc>
+          <w:tcPr>
+            <w:tcW w:w="1320" w:type="dxa"/>
+          </w:tcPr>
+          <w:p>
+            <w:r>
+              <w:t>Project requirement</w:t>
+            </w:r>
+          </w:p>
+        </w:tc>
+      </w:tr>
+      <w:tr>
+        <w:tc>
+          <w:tcPr>
+            <w:tcW w:w="682" w:type="dxa"/>
+          </w:tcPr>
+          <w:p>
+            <w:r>
+              <w:t>NFR7</w:t>
+            </w:r>
+          </w:p>
+        </w:tc>
+        <w:tc>
+          <w:tcPr>
+            <w:tcW w:w="2094" w:type="dxa"/>
+          </w:tcPr>
+          <w:p>
+            <w:r>
+              <w:t>Interoperability</w:t>
+            </w:r>
+          </w:p>
+        </w:tc>
+        <w:tc>
+          <w:tcPr>
+            <w:tcW w:w="1317" w:type="dxa"/>
+          </w:tcPr>
+          <w:p>
+            <w:r>
+              <w:t>The test</w:t>
+            </w:r>
+            <w:r>
+              <w:t xml:space="preserve"> harness shall support exchange of test data using the </w:t>
+            </w:r>
+            <w:r>
+              <w:t>FHIR standard.</w:t>
+            </w:r>
+          </w:p>
+        </w:tc>
+        <w:tc>
+          <w:tcPr>
+            <w:tcW w:w="1350" w:type="dxa"/>
+          </w:tcPr>
+          <w:p>
+            <w:r>
+              <w:t>100% defined FHIR test messages</w:t>
+            </w:r>
+            <w:r>
+              <w:t xml:space="preserve"> </w:t>
+            </w:r>
+            <w:r>
+              <w:t>include predefined request payload, expected responses/status</w:t>
+            </w:r>
+            <w:r>
+              <w:t xml:space="preserve"> outcome and validation against the FHIR standards.</w:t>
+            </w:r>
+            <w:r>
+              <w:t xml:space="preserve"> </w:t>
+            </w:r>
+          </w:p>
+        </w:tc>
+        <w:tc>
+          <w:tcPr>
+            <w:tcW w:w="1344" w:type="dxa"/>
+          </w:tcPr>
+          <w:p>
+            <w:r>
+              <w:t>FHIR interface (data exchange layer)</w:t>
+            </w:r>
+            <w:r>
+              <w:t xml:space="preserve"> being tested via the test harness and halo connect integration.</w:t>
+            </w:r>
+          </w:p>
+        </w:tc>
+        <w:tc>
+          <w:tcPr>
+            <w:tcW w:w="909" w:type="dxa"/>
+          </w:tcPr>
+          <w:p>
+            <w:r>
+              <w:t>High</w:t>
+            </w:r>
+          </w:p>
+        </w:tc>
+        <w:tc>
+          <w:tcPr>
+            <w:tcW w:w="1320" w:type="dxa"/>
+          </w:tcPr>
+          <w:p>
+            <w:r>
+              <w:t>Project Brief</w:t>
+            </w:r>
+          </w:p>
+        </w:tc>
+      </w:tr>
+    </w:tbl>
+    <w:p/>
+    <w:p>
+      <w:r>
+        <w:t>3.6 Requirements Prio</w:t>
+      </w:r>
+      <w:r>
+        <w:t>ritisation</w:t>
+      </w:r>
+    </w:p>
+    <w:tbl>
+      <w:tblPr>
+        <w:tblStyle w:val="TableGrid"/>
+        <w:tblW w:w="0" w:type="auto"/>
+        <w:tblLook w:val="04A0" w:firstRow="1" w:lastRow="0" w:firstColumn="1" w:lastColumn="0" w:noHBand="0" w:noVBand="1"/>
+      </w:tblPr>
+      <w:tblGrid>
+        <w:gridCol w:w="2405"/>
+        <w:gridCol w:w="6611"/>
+      </w:tblGrid>
+      <w:tr>
+        <w:tc>
+          <w:tcPr>
+            <w:tcW w:w="2405" w:type="dxa"/>
+          </w:tcPr>
+          <w:p>
+            <w:r>
+              <w:t>Priority</w:t>
+            </w:r>
+          </w:p>
+        </w:tc>
+        <w:tc>
+          <w:tcPr>
+            <w:tcW w:w="6611" w:type="dxa"/>
+          </w:tcPr>
+          <w:p>
+            <w:r>
+              <w:t>Project requirements assigned</w:t>
+            </w:r>
+          </w:p>
+        </w:tc>
+      </w:tr>
+      <w:tr>
+        <w:tc>
+          <w:tcPr>
+            <w:tcW w:w="2405" w:type="dxa"/>
+          </w:tcPr>
+          <w:p>
+            <w:r>
+              <w:t>Must have</w:t>
+            </w:r>
+          </w:p>
+        </w:tc>
+        <w:tc>
+          <w:tcPr>
+            <w:tcW w:w="6611" w:type="dxa"/>
+          </w:tcPr>
+          <w:p>
+            <w:r>
+              <w:t>FR</w:t>
+            </w:r>
+            <w:r>
+              <w:t xml:space="preserve">1, </w:t>
+            </w:r>
+            <w:r>
+              <w:t>FR</w:t>
+            </w:r>
+            <w:r>
+              <w:t>2</w:t>
+            </w:r>
+            <w:r>
+              <w:t xml:space="preserve">, </w:t>
+            </w:r>
+            <w:r>
+              <w:t>FR</w:t>
+            </w:r>
+            <w:r>
+              <w:t>3</w:t>
+            </w:r>
+            <w:r>
+              <w:t xml:space="preserve">, </w:t>
+            </w:r>
+            <w:r>
+              <w:t>FR</w:t>
+            </w:r>
+            <w:r>
+              <w:t>4</w:t>
+            </w:r>
+            <w:r>
+              <w:t xml:space="preserve">, </w:t>
+            </w:r>
+            <w:r>
+              <w:t>FR</w:t>
+            </w:r>
+            <w:r>
+              <w:t>5</w:t>
+            </w:r>
+            <w:r>
+              <w:t>,</w:t>
+            </w:r>
+            <w:r>
+              <w:t xml:space="preserve"> </w:t>
+            </w:r>
+            <w:r>
+              <w:t>FR</w:t>
+            </w:r>
+            <w:r>
+              <w:t>6</w:t>
+            </w:r>
+            <w:r>
+              <w:t xml:space="preserve">, </w:t>
+            </w:r>
+            <w:r>
+              <w:t>FR</w:t>
+            </w:r>
+            <w:r>
+              <w:t>7,</w:t>
+            </w:r>
+            <w:r>
+              <w:t xml:space="preserve"> </w:t>
+            </w:r>
+            <w:r>
+              <w:t>FR</w:t>
+            </w:r>
+            <w:r>
+              <w:t>9</w:t>
+            </w:r>
+            <w:r>
+              <w:t>,</w:t>
+            </w:r>
+            <w:r>
+              <w:t xml:space="preserve"> </w:t>
+            </w:r>
+            <w:r>
+              <w:t>FR</w:t>
+            </w:r>
+            <w:r>
+              <w:t>10</w:t>
+            </w:r>
+            <w:r>
+              <w:t>,</w:t>
+            </w:r>
+            <w:r>
+              <w:t xml:space="preserve"> </w:t>
+            </w:r>
+            <w:r>
+              <w:t>FR</w:t>
+            </w:r>
+            <w:r>
+              <w:t>11,</w:t>
+            </w:r>
+          </w:p>
+          <w:p>
+            <w:r>
+              <w:t>NFR1, NFR</w:t>
+            </w:r>
+            <w:r>
+              <w:t>2, NFR</w:t>
+            </w:r>
+            <w:r>
+              <w:t>3</w:t>
+            </w:r>
+            <w:r>
+              <w:t>, NFR</w:t>
+            </w:r>
+            <w:r>
+              <w:t>7,</w:t>
+            </w:r>
+          </w:p>
+        </w:tc>
+      </w:tr>
+      <w:tr>
+        <w:tc>
+          <w:tcPr>
+            <w:tcW w:w="2405" w:type="dxa"/>
+          </w:tcPr>
+          <w:p>
+            <w:r>
+              <w:t>Should have</w:t>
+            </w:r>
+          </w:p>
+        </w:tc>
+        <w:tc>
+          <w:tcPr>
+            <w:tcW w:w="6611" w:type="dxa"/>
+          </w:tcPr>
+          <w:p>
+            <w:r>
+              <w:t>FR8, FR</w:t>
+            </w:r>
+            <w:r>
+              <w:t>12, NFR</w:t>
+            </w:r>
+            <w:r>
+              <w:t>4</w:t>
+            </w:r>
+            <w:r>
+              <w:t>,</w:t>
+            </w:r>
+            <w:r>
+              <w:t xml:space="preserve"> </w:t>
+            </w:r>
+            <w:r>
+              <w:t>NFR5</w:t>
+            </w:r>
+          </w:p>
+        </w:tc>
+      </w:tr>
+      <w:tr>
+        <w:tc>
+          <w:tcPr>
+            <w:tcW w:w="2405" w:type="dxa"/>
+          </w:tcPr>
+          <w:p>
+            <w:r>
+              <w:t>Could have</w:t>
+            </w:r>
+          </w:p>
+        </w:tc>
+        <w:tc>
+          <w:tcPr>
+            <w:tcW w:w="6611" w:type="dxa"/>
+          </w:tcPr>
+          <w:p>
+            <w:r>
+              <w:t>NFR6</w:t>
+            </w:r>
+          </w:p>
+        </w:tc>
+      </w:tr>
+      <w:tr>
+        <w:tc>
+          <w:tcPr>
+            <w:tcW w:w="2405" w:type="dxa"/>
+          </w:tcPr>
+          <w:p>
+            <w:r>
+              <w:t>Will not have now</w:t>
+            </w:r>
+          </w:p>
+        </w:tc>
+        <w:tc>
+          <w:tcPr>
+            <w:tcW w:w="6611" w:type="dxa"/>
+          </w:tcPr>
+          <w:p>
+            <w:r>
+              <w:t>Medtalk integration</w:t>
+            </w:r>
+            <w:r>
+              <w:t>, real patient billing, real patient data</w:t>
+            </w:r>
+          </w:p>
+        </w:tc>
+      </w:tr>
+    </w:tbl>
+    <w:p/>
+    <w:p>
+      <w:r>
+        <w:t>3.7 Assumptions and Constraints</w:t>
+      </w:r>
+    </w:p>
+    <w:tbl>
+      <w:tblPr>
+        <w:tblStyle w:val="TableGrid"/>
+        <w:tblW w:w="0" w:type="auto"/>
+        <w:tblLook w:val="04A0" w:firstRow="1" w:lastRow="0" w:firstColumn="1" w:lastColumn="0" w:noHBand="0" w:noVBand="1"/>
+      </w:tblPr>
+      <w:tblGrid>
+        <w:gridCol w:w="777"/>
+        <w:gridCol w:w="1347"/>
+        <w:gridCol w:w="2111"/>
+        <w:gridCol w:w="2111"/>
+        <w:gridCol w:w="1672"/>
+        <w:gridCol w:w="998"/>
+      </w:tblGrid>
+      <w:tr>
+        <w:tc>
+          <w:tcPr>
+            <w:tcW w:w="777" w:type="dxa"/>
+          </w:tcPr>
+          <w:p>
+            <w:r>
+              <w:t>ID</w:t>
+            </w:r>
+          </w:p>
+        </w:tc>
+        <w:tc>
+          <w:tcPr>
+            <w:tcW w:w="1347" w:type="dxa"/>
+          </w:tcPr>
+          <w:p>
+            <w:r>
+              <w:t xml:space="preserve">Type </w:t>
+            </w:r>
+          </w:p>
+        </w:tc>
+        <w:tc>
+          <w:tcPr>
+            <w:tcW w:w="2111" w:type="dxa"/>
+          </w:tcPr>
+          <w:p>
+            <w:r>
+              <w:t>Statement</w:t>
+            </w:r>
+          </w:p>
+        </w:tc>
+        <w:tc>
+          <w:tcPr>
+            <w:tcW w:w="2111" w:type="dxa"/>
+          </w:tcPr>
+          <w:p>
+            <w:r>
+              <w:t>Project impact</w:t>
+            </w:r>
+            <w:r>
+              <w:t xml:space="preserve"> </w:t>
+            </w:r>
+          </w:p>
+        </w:tc>
+        <w:tc>
+          <w:tcPr>
+            <w:tcW w:w="1672" w:type="dxa"/>
+          </w:tcPr>
+          <w:p>
+            <w:r>
+              <w:t>Validation</w:t>
+            </w:r>
+          </w:p>
+        </w:tc>
+        <w:tc>
+          <w:tcPr>
+            <w:tcW w:w="998" w:type="dxa"/>
+          </w:tcPr>
+          <w:p>
+            <w:r>
+              <w:t>Owner</w:t>
+            </w:r>
+          </w:p>
+        </w:tc>
+      </w:tr>
+      <w:tr>
+        <w:tc>
+          <w:tcPr>
+            <w:tcW w:w="777" w:type="dxa"/>
+          </w:tcPr>
+          <w:p>
+            <w:r>
+              <w:t>AC1</w:t>
+            </w:r>
+          </w:p>
+        </w:tc>
+        <w:tc>
+          <w:tcPr>
+            <w:tcW w:w="1347" w:type="dxa"/>
+          </w:tcPr>
+          <w:p>
+            <w:r>
+              <w:t>constraint</w:t>
+            </w:r>
+          </w:p>
+        </w:tc>
+        <w:tc>
+          <w:tcPr>
+            <w:tcW w:w="2111" w:type="dxa"/>
+          </w:tcPr>
+          <w:p>
+            <w:r>
+              <w:t xml:space="preserve">Stage 1 only </w:t>
+            </w:r>
+            <w:r>
+              <w:t xml:space="preserve">focuses on </w:t>
+            </w:r>
+            <w:r>
+              <w:t>requirements</w:t>
+            </w:r>
+            <w:r>
+              <w:t xml:space="preserve"> and analysis following a waterfall model approach to project.</w:t>
+            </w:r>
+          </w:p>
+        </w:tc>
+        <w:tc>
+          <w:tcPr>
+            <w:tcW w:w="2111" w:type="dxa"/>
+          </w:tcPr>
+          <w:p>
+            <w:r>
+              <w:t xml:space="preserve">No precoding </w:t>
+            </w:r>
+            <w:r>
+              <w:t xml:space="preserve">to be </w:t>
+            </w:r>
+            <w:r>
+              <w:t xml:space="preserve">done to validate proposed architecture </w:t>
+            </w:r>
+            <w:r>
+              <w:t>and design</w:t>
+            </w:r>
+            <w:r>
+              <w:t>.</w:t>
+            </w:r>
+          </w:p>
+        </w:tc>
+        <w:tc>
+          <w:tcPr>
+            <w:tcW w:w="1672" w:type="dxa"/>
+          </w:tcPr>
+          <w:p>
+            <w:r>
+              <w:t xml:space="preserve">Alignment to assessment </w:t>
+            </w:r>
+            <w:r>
+              <w:t>brief.</w:t>
+            </w:r>
+          </w:p>
+        </w:tc>
+        <w:tc>
+          <w:tcPr>
+            <w:tcW w:w="998" w:type="dxa"/>
+          </w:tcPr>
+          <w:p>
+            <w:r>
+              <w:t>Team</w:t>
+            </w:r>
+          </w:p>
+        </w:tc>
+      </w:tr>
+      <w:tr>
+        <w:tc>
+          <w:tcPr>
+            <w:tcW w:w="777" w:type="dxa"/>
+          </w:tcPr>
+          <w:p>
+            <w:r>
+              <w:t>AC</w:t>
+            </w:r>
+            <w:r>
+              <w:t>2</w:t>
+            </w:r>
+          </w:p>
+        </w:tc>
+        <w:tc>
+          <w:tcPr>
+            <w:tcW w:w="1347" w:type="dxa"/>
+          </w:tcPr>
+          <w:p>
+            <w:r>
+              <w:t>Constraint</w:t>
+            </w:r>
+          </w:p>
+        </w:tc>
+        <w:tc>
+          <w:tcPr>
+            <w:tcW w:w="2111" w:type="dxa"/>
+          </w:tcPr>
+          <w:p>
+            <w:r>
+              <w:t xml:space="preserve">Budget and cloud services are not provided by </w:t>
+            </w:r>
+            <w:r>
+              <w:t>both client and College</w:t>
+            </w:r>
+          </w:p>
+        </w:tc>
+        <w:tc>
+          <w:tcPr>
+            <w:tcW w:w="2111" w:type="dxa"/>
+          </w:tcPr>
+          <w:p>
+            <w:r>
+              <w:t xml:space="preserve">The test harness would not be accessible </w:t>
+            </w:r>
+            <w:r>
+              <w:t>on the internet.</w:t>
+            </w:r>
+          </w:p>
+        </w:tc>
+        <w:tc>
+          <w:tcPr>
+            <w:tcW w:w="1672" w:type="dxa"/>
+          </w:tcPr>
+          <w:p>
+            <w:r>
+              <w:t>Client confirmation and College conformation.</w:t>
+            </w:r>
+          </w:p>
+        </w:tc>
+        <w:tc>
+          <w:tcPr>
+            <w:tcW w:w="998" w:type="dxa"/>
+          </w:tcPr>
+          <w:p>
+            <w:r>
+              <w:t>Team</w:t>
+            </w:r>
+          </w:p>
+        </w:tc>
+      </w:tr>
+      <w:tr>
+        <w:tc>
+          <w:tcPr>
+            <w:tcW w:w="777" w:type="dxa"/>
+          </w:tcPr>
+          <w:p>
+            <w:r>
+              <w:t>AC3</w:t>
+            </w:r>
+          </w:p>
+        </w:tc>
+        <w:tc>
+          <w:tcPr>
+            <w:tcW w:w="1347" w:type="dxa"/>
+          </w:tcPr>
+          <w:p>
+            <w:r>
+              <w:t>A</w:t>
+            </w:r>
+            <w:r>
+              <w:t>ssumption</w:t>
+            </w:r>
+          </w:p>
+        </w:tc>
+        <w:tc>
+          <w:tcPr>
+            <w:tcW w:w="2111" w:type="dxa"/>
+          </w:tcPr>
+          <w:p>
+            <w:r>
+              <w:t xml:space="preserve">Halo connect will </w:t>
+            </w:r>
+            <w:r>
+              <w:t>provide a</w:t>
+            </w:r>
+            <w:r>
+              <w:t xml:space="preserve"> set of </w:t>
+            </w:r>
+            <w:r>
+              <w:t>defined</w:t>
+            </w:r>
+            <w:r>
+              <w:t xml:space="preserve"> FHIR resources/endpoints</w:t>
+            </w:r>
+            <w:r>
+              <w:t xml:space="preserve"> to ensure the test </w:t>
+            </w:r>
+            <w:r>
+              <w:lastRenderedPageBreak/>
+              <w:t>harness send/receive data.</w:t>
+            </w:r>
+            <w:r>
+              <w:t xml:space="preserve"> </w:t>
+            </w:r>
+          </w:p>
+        </w:tc>
+        <w:tc>
+          <w:tcPr>
+            <w:tcW w:w="2111" w:type="dxa"/>
+          </w:tcPr>
+          <w:p>
+            <w:r>
+              <w:lastRenderedPageBreak/>
+              <w:t xml:space="preserve">If Halo </w:t>
+            </w:r>
+            <w:r>
+              <w:t>C</w:t>
+            </w:r>
+            <w:r>
+              <w:t xml:space="preserve">onnect </w:t>
+            </w:r>
+            <w:proofErr w:type="gramStart"/>
+            <w:r>
+              <w:t>expect</w:t>
+            </w:r>
+            <w:proofErr w:type="gramEnd"/>
+            <w:r>
+              <w:t xml:space="preserve"> different resources/endpoints </w:t>
+            </w:r>
+            <w:r>
+              <w:t xml:space="preserve">the test harness would not run </w:t>
+            </w:r>
+            <w:r>
+              <w:t xml:space="preserve">or </w:t>
+            </w:r>
+            <w:proofErr w:type="gramStart"/>
+            <w:r>
+              <w:lastRenderedPageBreak/>
+              <w:t>mimic</w:t>
+            </w:r>
+            <w:proofErr w:type="gramEnd"/>
+            <w:r>
+              <w:t xml:space="preserve"> the</w:t>
+            </w:r>
+            <w:r>
+              <w:t xml:space="preserve"> </w:t>
+            </w:r>
+            <w:r>
+              <w:t>real-world</w:t>
+            </w:r>
+            <w:r>
+              <w:t xml:space="preserve"> integration.</w:t>
+            </w:r>
+            <w:r>
+              <w:t xml:space="preserve"> </w:t>
+            </w:r>
+          </w:p>
+        </w:tc>
+        <w:tc>
+          <w:tcPr>
+            <w:tcW w:w="1672" w:type="dxa"/>
+          </w:tcPr>
+          <w:p>
+            <w:r>
+              <w:lastRenderedPageBreak/>
+              <w:t xml:space="preserve">Halo connect documentation to be reviewed and confirm the </w:t>
+            </w:r>
+            <w:r>
+              <w:t>integration</w:t>
+            </w:r>
+            <w:r>
+              <w:t xml:space="preserve"> </w:t>
+            </w:r>
+            <w:r>
+              <w:lastRenderedPageBreak/>
+              <w:t>supported resources</w:t>
+            </w:r>
+            <w:r>
+              <w:t xml:space="preserve"> or </w:t>
+            </w:r>
+            <w:r>
+              <w:t>endpoints</w:t>
+            </w:r>
+            <w:r>
+              <w:t xml:space="preserve"> or </w:t>
+            </w:r>
+            <w:r>
+              <w:t>profiles.</w:t>
+            </w:r>
+          </w:p>
+        </w:tc>
+        <w:tc>
+          <w:tcPr>
+            <w:tcW w:w="998" w:type="dxa"/>
+          </w:tcPr>
+          <w:p>
+            <w:r>
+              <w:lastRenderedPageBreak/>
+              <w:t>Rikesh</w:t>
+            </w:r>
+          </w:p>
+        </w:tc>
+      </w:tr>
+      <w:tr>
+        <w:tc>
+          <w:tcPr>
+            <w:tcW w:w="777" w:type="dxa"/>
+          </w:tcPr>
+          <w:p>
+            <w:r>
+              <w:t>AC4</w:t>
+            </w:r>
+          </w:p>
+        </w:tc>
+        <w:tc>
+          <w:tcPr>
+            <w:tcW w:w="1347" w:type="dxa"/>
+          </w:tcPr>
+          <w:p>
+            <w:r>
+              <w:t>Constraint</w:t>
+            </w:r>
+          </w:p>
+        </w:tc>
+        <w:tc>
+          <w:tcPr>
+            <w:tcW w:w="2111" w:type="dxa"/>
+          </w:tcPr>
+          <w:p>
+            <w:r>
+              <w:t>The test harness will only use synthetic pat</w:t>
+            </w:r>
+            <w:r>
+              <w:t>ient records only.</w:t>
+            </w:r>
+          </w:p>
+        </w:tc>
+        <w:tc>
+          <w:tcPr>
+            <w:tcW w:w="2111" w:type="dxa"/>
+          </w:tcPr>
+          <w:p>
+            <w:r>
+              <w:t xml:space="preserve">Breach of </w:t>
+            </w:r>
+            <w:r>
+              <w:t>healthcare</w:t>
+            </w:r>
+            <w:r>
+              <w:t xml:space="preserve"> privacy </w:t>
+            </w:r>
+            <w:r>
+              <w:t xml:space="preserve">laws </w:t>
+            </w:r>
+            <w:r>
+              <w:t xml:space="preserve">and </w:t>
+            </w:r>
+            <w:r>
+              <w:t>internal data gover</w:t>
+            </w:r>
+            <w:r>
+              <w:t>nance policies.</w:t>
+            </w:r>
+          </w:p>
+        </w:tc>
+        <w:tc>
+          <w:tcPr>
+            <w:tcW w:w="1672" w:type="dxa"/>
+          </w:tcPr>
+          <w:p>
+            <w:r>
+              <w:t>Confirm data generation method</w:t>
+            </w:r>
+            <w:r>
+              <w:t xml:space="preserve"> and verify dataset does not contain personal </w:t>
+            </w:r>
+            <w:r>
+              <w:t>identifiers.</w:t>
+            </w:r>
+          </w:p>
+        </w:tc>
+        <w:tc>
+          <w:tcPr>
+            <w:tcW w:w="998" w:type="dxa"/>
+          </w:tcPr>
+          <w:p>
+            <w:r>
+              <w:t>Charity</w:t>
+            </w:r>
+          </w:p>
+        </w:tc>
+      </w:tr>
+      <w:tr>
+        <w:tc>
+          <w:tcPr>
+            <w:tcW w:w="777" w:type="dxa"/>
+          </w:tcPr>
+          <w:p>
+            <w:r>
+              <w:t>AC5</w:t>
+            </w:r>
+          </w:p>
+        </w:tc>
+        <w:tc>
+          <w:tcPr>
+            <w:tcW w:w="1347" w:type="dxa"/>
+          </w:tcPr>
+          <w:p>
+            <w:r>
+              <w:t>Assumption</w:t>
+            </w:r>
+          </w:p>
+        </w:tc>
+        <w:tc>
+          <w:tcPr>
+            <w:tcW w:w="2111" w:type="dxa"/>
+          </w:tcPr>
+          <w:p>
+            <w:r>
+              <w:t>The mapping of SNOMED-CT-AU to IC</w:t>
+            </w:r>
+            <w:r>
+              <w:t>D-</w:t>
+            </w:r>
+            <w:r>
+              <w:t xml:space="preserve">10-AM </w:t>
+            </w:r>
+            <w:r>
+              <w:t xml:space="preserve">used by the test harness </w:t>
+            </w:r>
+            <w:r>
+              <w:t>is defined and agreed on in stage 1</w:t>
+            </w:r>
+          </w:p>
+        </w:tc>
+        <w:tc>
+          <w:tcPr>
+            <w:tcW w:w="2111" w:type="dxa"/>
+          </w:tcPr>
+          <w:p>
+            <w:r>
+              <w:t>Wrong billing/clinical records mapping results in misleading outcomes</w:t>
+            </w:r>
+            <w:r>
+              <w:t xml:space="preserve"> or test fails</w:t>
+            </w:r>
+            <w:r>
+              <w:t>.</w:t>
+            </w:r>
+          </w:p>
+        </w:tc>
+        <w:tc>
+          <w:tcPr>
+            <w:tcW w:w="1672" w:type="dxa"/>
+          </w:tcPr>
+          <w:p>
+            <w:r>
+              <w:t>Validating mapping rules against the mapping documentation.</w:t>
+            </w:r>
+          </w:p>
+        </w:tc>
+        <w:tc>
+          <w:tcPr>
+            <w:tcW w:w="998" w:type="dxa"/>
+          </w:tcPr>
+          <w:p>
+            <w:r>
+              <w:t>Charity</w:t>
+            </w:r>
+          </w:p>
+        </w:tc>
+      </w:tr>
+      <w:tr>
+        <w:tc>
+          <w:tcPr>
+            <w:tcW w:w="777" w:type="dxa"/>
+          </w:tcPr>
+          <w:p>
+            <w:r>
+              <w:t>AC6</w:t>
+            </w:r>
+          </w:p>
+        </w:tc>
+        <w:tc>
+          <w:tcPr>
+            <w:tcW w:w="1347" w:type="dxa"/>
+          </w:tcPr>
+          <w:p>
+            <w:r>
+              <w:t>Assu</w:t>
+            </w:r>
+            <w:r>
+              <w:t>mption</w:t>
+            </w:r>
+          </w:p>
+        </w:tc>
+        <w:tc>
+          <w:tcPr>
+            <w:tcW w:w="2111" w:type="dxa"/>
+          </w:tcPr>
+          <w:p>
+            <w:r>
+              <w:t xml:space="preserve">The test harness will </w:t>
+            </w:r>
+            <w:r>
+              <w:t>be able to simulate</w:t>
+            </w:r>
+            <w:r>
+              <w:t xml:space="preserve"> </w:t>
+            </w:r>
+            <w:r>
+              <w:t xml:space="preserve">/ validate/ detect </w:t>
+            </w:r>
+            <w:r>
+              <w:t>good data, bad data, dropped/ slow response.</w:t>
+            </w:r>
+          </w:p>
+        </w:tc>
+        <w:tc>
+          <w:tcPr>
+            <w:tcW w:w="2111" w:type="dxa"/>
+          </w:tcPr>
+          <w:p>
+            <w:r>
+              <w:t>Tests would not prove rob</w:t>
+            </w:r>
+            <w:r>
+              <w:t>ustness of the test harness which lead to system failures to go undetected.</w:t>
+            </w:r>
+          </w:p>
+        </w:tc>
+        <w:tc>
+          <w:tcPr>
+            <w:tcW w:w="1672" w:type="dxa"/>
+          </w:tcPr>
+          <w:p>
+            <w:r>
+              <w:t xml:space="preserve">Create fault test plans to validate </w:t>
+            </w:r>
+            <w:r>
+              <w:t>whether</w:t>
+            </w:r>
+            <w:r>
+              <w:t xml:space="preserve"> the test harness </w:t>
+            </w:r>
+            <w:r>
+              <w:t>detects</w:t>
+            </w:r>
+            <w:r>
+              <w:t xml:space="preserve"> </w:t>
+            </w:r>
+            <w:r>
+              <w:t>them.</w:t>
+            </w:r>
+          </w:p>
+        </w:tc>
+        <w:tc>
+          <w:tcPr>
+            <w:tcW w:w="998" w:type="dxa"/>
+          </w:tcPr>
+          <w:p>
+            <w:r>
+              <w:t>Zubair</w:t>
+            </w:r>
+          </w:p>
+        </w:tc>
+      </w:tr>
+      <w:tr>
+        <w:tc>
+          <w:tcPr>
+            <w:tcW w:w="777" w:type="dxa"/>
+          </w:tcPr>
+          <w:p>
+            <w:r>
+              <w:t>AC7</w:t>
+            </w:r>
+          </w:p>
+        </w:tc>
+        <w:tc>
+          <w:tcPr>
+            <w:tcW w:w="1347" w:type="dxa"/>
+          </w:tcPr>
+          <w:p>
+            <w:r>
+              <w:t>Constraint</w:t>
+            </w:r>
+          </w:p>
+        </w:tc>
+        <w:tc>
+          <w:tcPr>
+            <w:tcW w:w="2111" w:type="dxa"/>
+          </w:tcPr>
+          <w:p>
+            <w:r>
+              <w:t>The project stakeholder will provide the necessary documen</w:t>
+            </w:r>
+            <w:r>
+              <w:t>tation (FHIR,</w:t>
+            </w:r>
+            <w:r>
+              <w:t xml:space="preserve"> Halo Connect,</w:t>
+            </w:r>
+            <w:r>
+              <w:t xml:space="preserve"> connection specifications</w:t>
+            </w:r>
+            <w:r>
+              <w:t>)</w:t>
+            </w:r>
+          </w:p>
+        </w:tc>
+        <w:tc>
+          <w:tcPr>
+            <w:tcW w:w="2111" w:type="dxa"/>
+          </w:tcPr>
+          <w:p>
+            <w:r>
+              <w:t>Delay</w:t>
+            </w:r>
+            <w:r>
+              <w:t>s</w:t>
+            </w:r>
+            <w:r>
+              <w:t xml:space="preserve"> in </w:t>
+            </w:r>
+            <w:r>
+              <w:t>defining project scope/ requirements</w:t>
+            </w:r>
+            <w:r>
+              <w:t xml:space="preserve"> leading to schedule slip.</w:t>
+            </w:r>
+          </w:p>
+        </w:tc>
+        <w:tc>
+          <w:tcPr>
+            <w:tcW w:w="1672" w:type="dxa"/>
+          </w:tcPr>
+          <w:p>
+            <w:r>
+              <w:t xml:space="preserve">Tracking document requests </w:t>
+            </w:r>
+            <w:r>
+              <w:t>and obtain versions/links on an agreed deadline.</w:t>
+            </w:r>
+          </w:p>
+        </w:tc>
+        <w:tc>
+          <w:tcPr>
+            <w:tcW w:w="998" w:type="dxa"/>
+          </w:tcPr>
+          <w:p>
+            <w:r>
+              <w:t>Sonam</w:t>
+            </w:r>
+          </w:p>
+        </w:tc>
+      </w:tr>
+    </w:tbl>
+    <w:p/>
+    <w:p>
+      <w:r>
+        <w:t>Open Questions for Client or Supervisor</w:t>
+      </w:r>
+    </w:p>
     <w:p/>
     <w:sectPr>
       <w:pgSz w:w="11906" w:h="16838"/>

</xml_diff>